<commit_message>
Update MTL template, add button
</commit_message>
<xml_diff>
--- a/storage/templates/mtl_template_v1.docx
+++ b/storage/templates/mtl_template_v1.docx
@@ -2,141 +2,6 @@
 <file path=word/document.xml><?xml version="1.0" encoding="utf-8"?>
 <w:document xmlns:wpc="http://schemas.microsoft.com/office/word/2010/wordprocessingCanvas" xmlns:cx="http://schemas.microsoft.com/office/drawing/2014/chartex" xmlns:cx1="http://schemas.microsoft.com/office/drawing/2015/9/8/chartex" xmlns:cx2="http://schemas.microsoft.com/office/drawing/2015/10/21/chartex" xmlns:cx3="http://schemas.microsoft.com/office/drawing/2016/5/9/chartex" xmlns:cx4="http://schemas.microsoft.com/office/drawing/2016/5/10/chartex" xmlns:cx5="http://schemas.microsoft.com/office/drawing/2016/5/11/chartex" xmlns:cx6="http://schemas.microsoft.com/office/drawing/2016/5/12/chartex" xmlns:cx7="http://schemas.microsoft.com/office/drawing/2016/5/13/chartex" xmlns:cx8="http://schemas.microsoft.com/office/drawing/2016/5/14/chartex" xmlns:mc="http://schemas.openxmlformats.org/markup-compatibility/2006" xmlns:aink="http://schemas.microsoft.com/office/drawing/2016/ink" xmlns:am3d="http://schemas.microsoft.com/office/drawing/2017/model3d" xmlns:o="urn:schemas-microsoft-com:office:office" xmlns:oel="http://schemas.microsoft.com/office/2019/extlst" xmlns:r="http://schemas.openxmlformats.org/officeDocument/2006/relationships" xmlns:m="http://schemas.openxmlformats.org/officeDocument/2006/math" xmlns:v="urn:schemas-microsoft-com:vml" xmlns:wp14="http://schemas.microsoft.com/office/word/2010/wordprocessingDrawing" xmlns:wp="http://schemas.openxmlformats.org/drawingml/2006/wordprocessingDrawing" xmlns:w10="urn:schemas-microsoft-com:office:word" xmlns:w="http://schemas.openxmlformats.org/wordprocessingml/2006/main" xmlns:w14="http://schemas.microsoft.com/office/word/2010/wordml" xmlns:w15="http://schemas.microsoft.com/office/word/2012/wordml" xmlns:w16cex="http://schemas.microsoft.com/office/word/2018/wordml/cex" xmlns:w16cid="http://schemas.microsoft.com/office/word/2016/wordml/cid" xmlns:w16="http://schemas.microsoft.com/office/word/2018/wordml" xmlns:w16du="http://schemas.microsoft.com/office/word/2023/wordml/word16du" xmlns:w16sdtdh="http://schemas.microsoft.com/office/word/2020/wordml/sdtdatahash" xmlns:w16sdtfl="http://schemas.microsoft.com/office/word/2024/wordml/sdtformatlock" xmlns:w16se="http://schemas.microsoft.com/office/word/2015/wordml/symex" xmlns:wpg="http://schemas.microsoft.com/office/word/2010/wordprocessingGroup" xmlns:wpi="http://schemas.microsoft.com/office/word/2010/wordprocessingInk" xmlns:wne="http://schemas.microsoft.com/office/word/2006/wordml" xmlns:wps="http://schemas.microsoft.com/office/word/2010/wordprocessingShape" mc:Ignorable="w14 w15 w16se w16cid w16 w16cex w16sdtdh w16sdtfl w16du wp14">
   <w:body>
-    <w:p>
-      <w:pPr>
-        <w:spacing w:after="0" w:line="240" w:lineRule="auto"/>
-        <w:jc w:val="right"/>
-        <w:rPr>
-          <w:rFonts w:ascii="Times New Roman" w:hAnsi="Times New Roman" w:cs="Times New Roman"/>
-          <w:sz w:val="24"/>
-          <w:szCs w:val="24"/>
-        </w:rPr>
-      </w:pPr>
-      <w:r>
-        <w:rPr>
-          <w:rFonts w:ascii="Times New Roman" w:hAnsi="Times New Roman" w:cs="Times New Roman"/>
-          <w:sz w:val="24"/>
-          <w:szCs w:val="24"/>
-        </w:rPr>
-        <w:t>8. pielikums</w:t>
-      </w:r>
-    </w:p>
-    <w:p>
-      <w:pPr>
-        <w:spacing w:after="0" w:line="240" w:lineRule="auto"/>
-        <w:jc w:val="right"/>
-        <w:rPr>
-          <w:rFonts w:ascii="Times New Roman" w:hAnsi="Times New Roman" w:cs="Times New Roman"/>
-          <w:sz w:val="24"/>
-          <w:szCs w:val="24"/>
-        </w:rPr>
-      </w:pPr>
-      <w:r>
-        <w:rPr>
-          <w:rFonts w:ascii="Times New Roman" w:hAnsi="Times New Roman" w:cs="Times New Roman"/>
-          <w:sz w:val="24"/>
-          <w:szCs w:val="24"/>
-        </w:rPr>
-        <w:t>Aizsardzības ministrijas</w:t>
-      </w:r>
-    </w:p>
-    <w:p>
-      <w:pPr>
-        <w:spacing w:after="0" w:line="240" w:lineRule="auto"/>
-        <w:jc w:val="right"/>
-        <w:rPr>
-          <w:rFonts w:ascii="Times New Roman" w:hAnsi="Times New Roman" w:cs="Times New Roman"/>
-          <w:color w:val="000000"/>
-          <w:sz w:val="24"/>
-          <w:szCs w:val="24"/>
-        </w:rPr>
-      </w:pPr>
-      <w:r>
-        <w:rPr>
-          <w:rFonts w:ascii="Times New Roman" w:hAnsi="Times New Roman" w:cs="Times New Roman"/>
-          <w:noProof/>
-          <w:color w:val="000000"/>
-          <w:sz w:val="24"/>
-          <w:szCs w:val="24"/>
-        </w:rPr>
-        <w:t>15.06.2022</w:t>
-      </w:r>
-      <w:r>
-        <w:rPr>
-          <w:rFonts w:ascii="Times New Roman" w:hAnsi="Times New Roman" w:cs="Times New Roman"/>
-          <w:color w:val="000000"/>
-          <w:sz w:val="24"/>
-          <w:szCs w:val="24"/>
-        </w:rPr>
-        <w:t>.</w:t>
-      </w:r>
-    </w:p>
-    <w:p>
-      <w:pPr>
-        <w:spacing w:after="0" w:line="240" w:lineRule="auto"/>
-        <w:jc w:val="right"/>
-        <w:rPr>
-          <w:rFonts w:ascii="Times New Roman" w:hAnsi="Times New Roman" w:cs="Times New Roman"/>
-          <w:sz w:val="24"/>
-          <w:szCs w:val="24"/>
-        </w:rPr>
-      </w:pPr>
-      <w:r>
-        <w:rPr>
-          <w:rFonts w:ascii="Times New Roman" w:hAnsi="Times New Roman" w:cs="Times New Roman"/>
-          <w:sz w:val="24"/>
-          <w:szCs w:val="24"/>
-        </w:rPr>
-        <w:t>pavēlei</w:t>
-      </w:r>
-      <w:r>
-        <w:rPr>
-          <w:rFonts w:ascii="Times New Roman" w:hAnsi="Times New Roman" w:cs="Times New Roman"/>
-          <w:color w:val="FF0000"/>
-          <w:sz w:val="24"/>
-          <w:szCs w:val="24"/>
-        </w:rPr>
-        <w:t xml:space="preserve"> </w:t>
-      </w:r>
-      <w:r>
-        <w:rPr>
-          <w:rFonts w:ascii="Times New Roman" w:hAnsi="Times New Roman" w:cs="Times New Roman"/>
-          <w:sz w:val="24"/>
-          <w:szCs w:val="24"/>
-        </w:rPr>
-        <w:t>Nr.</w:t>
-      </w:r>
-      <w:r>
-        <w:rPr>
-          <w:rFonts w:ascii="Times New Roman" w:hAnsi="Times New Roman" w:cs="Times New Roman"/>
-          <w:noProof/>
-          <w:color w:val="000000"/>
-          <w:sz w:val="24"/>
-          <w:szCs w:val="24"/>
-        </w:rPr>
-        <w:t>75-P</w:t>
-      </w:r>
-    </w:p>
-    <w:p>
-      <w:pPr>
-        <w:spacing w:after="0" w:line="240" w:lineRule="auto"/>
-        <w:rPr>
-          <w:rFonts w:ascii="Times New Roman" w:hAnsi="Times New Roman" w:cs="Times New Roman"/>
-          <w:sz w:val="24"/>
-          <w:szCs w:val="24"/>
-        </w:rPr>
-      </w:pPr>
-    </w:p>
-    <w:p>
-      <w:pPr>
-        <w:spacing w:after="0" w:line="240" w:lineRule="auto"/>
-        <w:rPr>
-          <w:rFonts w:ascii="Times New Roman" w:hAnsi="Times New Roman" w:cs="Times New Roman"/>
-          <w:sz w:val="24"/>
-          <w:szCs w:val="24"/>
-        </w:rPr>
-      </w:pPr>
-    </w:p>
     <w:p>
       <w:pPr>
         <w:spacing w:after="0" w:line="240" w:lineRule="auto"/>
@@ -285,62 +150,7 @@
                                 <w:rFonts w:ascii="Times New Roman" w:hAnsi="Times New Roman" w:cs="Times New Roman"/>
                                 <w:sz w:val="24"/>
                               </w:rPr>
-                              <w:t>nodod_vards</w:t>
-                            </w:r>
-                            <w:r>
-                              <w:rPr>
-                                <w:rFonts w:ascii="Times New Roman" w:hAnsi="Times New Roman" w:cs="Times New Roman"/>
-                                <w:sz w:val="24"/>
-                              </w:rPr>
-                              <w:t>_uzv</w:t>
-                            </w:r>
-                            <w:proofErr w:type="spellEnd"/>
-                            <w:r>
-                              <w:rPr>
-                                <w:rFonts w:ascii="Times New Roman" w:hAnsi="Times New Roman" w:cs="Times New Roman"/>
-                                <w:sz w:val="24"/>
-                              </w:rPr>
-                              <w:t>}, ${</w:t>
-                            </w:r>
-                            <w:proofErr w:type="spellStart"/>
-                            <w:r>
-                              <w:rPr>
-                                <w:rFonts w:ascii="Times New Roman" w:hAnsi="Times New Roman" w:cs="Times New Roman"/>
-                                <w:sz w:val="24"/>
-                              </w:rPr>
-                              <w:t>nodod_pers_kods</w:t>
-                            </w:r>
-                            <w:proofErr w:type="spellEnd"/>
-                            <w:r>
-                              <w:rPr>
-                                <w:rFonts w:ascii="Times New Roman" w:hAnsi="Times New Roman" w:cs="Times New Roman"/>
-                                <w:sz w:val="24"/>
-                              </w:rPr>
-                              <w:t>}, ${</w:t>
-                            </w:r>
-                            <w:proofErr w:type="spellStart"/>
-                            <w:r>
-                              <w:rPr>
-                                <w:rFonts w:ascii="Times New Roman" w:hAnsi="Times New Roman" w:cs="Times New Roman"/>
-                                <w:sz w:val="24"/>
-                              </w:rPr>
-                              <w:t>nodod_telefons</w:t>
-                            </w:r>
-                            <w:proofErr w:type="spellEnd"/>
-                            <w:r>
-                              <w:rPr>
-                                <w:rFonts w:ascii="Times New Roman" w:hAnsi="Times New Roman" w:cs="Times New Roman"/>
-                                <w:sz w:val="24"/>
-                              </w:rPr>
-                              <w:t>}, ${</w:t>
-                            </w:r>
-                            <w:proofErr w:type="spellStart"/>
-                            <w:r>
-                              <w:rPr>
-                                <w:rFonts w:ascii="Times New Roman" w:hAnsi="Times New Roman" w:cs="Times New Roman"/>
-                                <w:sz w:val="24"/>
-                              </w:rPr>
-                              <w:t>nodod_epasts</w:t>
+                              <w:t>nodod_personas_informacija</w:t>
                             </w:r>
                             <w:proofErr w:type="spellEnd"/>
                             <w:r>
@@ -392,78 +202,7 @@
                           <w:rFonts w:ascii="Times New Roman" w:hAnsi="Times New Roman" w:cs="Times New Roman"/>
                           <w:sz w:val="24"/>
                         </w:rPr>
-                        <w:t>${</w:t>
-                      </w:r>
-                      <w:proofErr w:type="spellStart"/>
-                      <w:r>
-                        <w:rPr>
-                          <w:rFonts w:ascii="Times New Roman" w:hAnsi="Times New Roman" w:cs="Times New Roman"/>
-                          <w:sz w:val="24"/>
-                        </w:rPr>
-                        <w:t>nodod_vards</w:t>
-                      </w:r>
-                      <w:r>
-                        <w:rPr>
-                          <w:rFonts w:ascii="Times New Roman" w:hAnsi="Times New Roman" w:cs="Times New Roman"/>
-                          <w:sz w:val="24"/>
-                        </w:rPr>
-                        <w:t>_uzv</w:t>
-                      </w:r>
-                      <w:proofErr w:type="spellEnd"/>
-                      <w:r>
-                        <w:rPr>
-                          <w:rFonts w:ascii="Times New Roman" w:hAnsi="Times New Roman" w:cs="Times New Roman"/>
-                          <w:sz w:val="24"/>
-                        </w:rPr>
-                        <w:t>}, ${</w:t>
-                      </w:r>
-                      <w:proofErr w:type="spellStart"/>
-                      <w:r>
-                        <w:rPr>
-                          <w:rFonts w:ascii="Times New Roman" w:hAnsi="Times New Roman" w:cs="Times New Roman"/>
-                          <w:sz w:val="24"/>
-                        </w:rPr>
-                        <w:t>nodod_pers_kods</w:t>
-                      </w:r>
-                      <w:proofErr w:type="spellEnd"/>
-                      <w:r>
-                        <w:rPr>
-                          <w:rFonts w:ascii="Times New Roman" w:hAnsi="Times New Roman" w:cs="Times New Roman"/>
-                          <w:sz w:val="24"/>
-                        </w:rPr>
-                        <w:t>}, ${</w:t>
-                      </w:r>
-                      <w:proofErr w:type="spellStart"/>
-                      <w:r>
-                        <w:rPr>
-                          <w:rFonts w:ascii="Times New Roman" w:hAnsi="Times New Roman" w:cs="Times New Roman"/>
-                          <w:sz w:val="24"/>
-                        </w:rPr>
-                        <w:t>nodod_telefons</w:t>
-                      </w:r>
-                      <w:proofErr w:type="spellEnd"/>
-                      <w:r>
-                        <w:rPr>
-                          <w:rFonts w:ascii="Times New Roman" w:hAnsi="Times New Roman" w:cs="Times New Roman"/>
-                          <w:sz w:val="24"/>
-                        </w:rPr>
-                        <w:t>}, ${</w:t>
-                      </w:r>
-                      <w:proofErr w:type="spellStart"/>
-                      <w:r>
-                        <w:rPr>
-                          <w:rFonts w:ascii="Times New Roman" w:hAnsi="Times New Roman" w:cs="Times New Roman"/>
-                          <w:sz w:val="24"/>
-                        </w:rPr>
-                        <w:t>nodod_epasts</w:t>
-                      </w:r>
-                      <w:proofErr w:type="spellEnd"/>
-                      <w:r>
-                        <w:rPr>
-                          <w:rFonts w:ascii="Times New Roman" w:hAnsi="Times New Roman" w:cs="Times New Roman"/>
-                          <w:sz w:val="24"/>
-                        </w:rPr>
-                        <w:t>}</w:t>
+                        <w:t>${nodod_personas_informacija}</w:t>
                       </w:r>
                     </w:p>
                   </w:txbxContent>
@@ -588,13 +327,13 @@
         <w:tblLook w:val="04A0" w:firstRow="1" w:lastRow="0" w:firstColumn="1" w:lastColumn="0" w:noHBand="0" w:noVBand="1"/>
       </w:tblPr>
       <w:tblGrid>
-        <w:gridCol w:w="1700"/>
-        <w:gridCol w:w="7087"/>
+        <w:gridCol w:w="1838"/>
+        <w:gridCol w:w="6949"/>
       </w:tblGrid>
       <w:tr>
         <w:tc>
           <w:tcPr>
-            <w:tcW w:w="846" w:type="dxa"/>
+            <w:tcW w:w="1838" w:type="dxa"/>
             <w:tcBorders>
               <w:top w:val="single" w:sz="4" w:space="0" w:color="auto"/>
               <w:left w:val="single" w:sz="4" w:space="0" w:color="auto"/>
@@ -654,7 +393,7 @@
         </w:tc>
         <w:tc>
           <w:tcPr>
-            <w:tcW w:w="7087" w:type="dxa"/>
+            <w:tcW w:w="6949" w:type="dxa"/>
             <w:tcBorders>
               <w:top w:val="single" w:sz="4" w:space="0" w:color="auto"/>
               <w:left w:val="single" w:sz="4" w:space="0" w:color="auto"/>
@@ -695,7 +434,7 @@
       <w:tr>
         <w:tc>
           <w:tcPr>
-            <w:tcW w:w="846" w:type="dxa"/>
+            <w:tcW w:w="1838" w:type="dxa"/>
             <w:tcBorders>
               <w:top w:val="single" w:sz="4" w:space="0" w:color="auto"/>
               <w:left w:val="single" w:sz="4" w:space="0" w:color="auto"/>
@@ -705,6 +444,7 @@
           </w:tcPr>
           <w:p>
             <w:pPr>
+              <w:jc w:val="center"/>
               <w:rPr>
                 <w:rFonts w:ascii="Times New Roman" w:hAnsi="Times New Roman" w:cs="Times New Roman"/>
                 <w:b/>
@@ -754,7 +494,7 @@
         </w:tc>
         <w:tc>
           <w:tcPr>
-            <w:tcW w:w="7087" w:type="dxa"/>
+            <w:tcW w:w="6949" w:type="dxa"/>
             <w:tcBorders>
               <w:top w:val="single" w:sz="4" w:space="0" w:color="auto"/>
               <w:left w:val="single" w:sz="4" w:space="0" w:color="auto"/>
@@ -785,7 +525,7 @@
       <w:tr>
         <w:tc>
           <w:tcPr>
-            <w:tcW w:w="846" w:type="dxa"/>
+            <w:tcW w:w="1838" w:type="dxa"/>
             <w:tcBorders>
               <w:top w:val="single" w:sz="4" w:space="0" w:color="auto"/>
               <w:left w:val="single" w:sz="4" w:space="0" w:color="auto"/>
@@ -795,6 +535,7 @@
           </w:tcPr>
           <w:p>
             <w:pPr>
+              <w:jc w:val="center"/>
               <w:rPr>
                 <w:rFonts w:ascii="Times New Roman" w:hAnsi="Times New Roman" w:cs="Times New Roman"/>
                 <w:b/>
@@ -844,7 +585,7 @@
         </w:tc>
         <w:tc>
           <w:tcPr>
-            <w:tcW w:w="7087" w:type="dxa"/>
+            <w:tcW w:w="6949" w:type="dxa"/>
             <w:tcBorders>
               <w:top w:val="single" w:sz="4" w:space="0" w:color="auto"/>
               <w:left w:val="single" w:sz="4" w:space="0" w:color="auto"/>
@@ -868,6 +609,80 @@
                 <w:szCs w:val="24"/>
               </w:rPr>
               <w:t>nepilngadīgā jaunsarga likumiskais pārstāvis</w:t>
+            </w:r>
+          </w:p>
+        </w:tc>
+      </w:tr>
+      <w:tr>
+        <w:trPr>
+          <w:trHeight w:val="333"/>
+        </w:trPr>
+        <w:tc>
+          <w:tcPr>
+            <w:tcW w:w="1838" w:type="dxa"/>
+            <w:tcBorders>
+              <w:top w:val="single" w:sz="4" w:space="0" w:color="auto"/>
+              <w:left w:val="single" w:sz="4" w:space="0" w:color="auto"/>
+              <w:bottom w:val="single" w:sz="4" w:space="0" w:color="auto"/>
+              <w:right w:val="single" w:sz="4" w:space="0" w:color="auto"/>
+            </w:tcBorders>
+            <w:shd w:val="clear" w:color="auto" w:fill="000000" w:themeFill="text1"/>
+          </w:tcPr>
+          <w:p>
+            <w:pPr>
+              <w:rPr>
+                <w:rFonts w:ascii="Times New Roman" w:hAnsi="Times New Roman" w:cs="Times New Roman"/>
+                <w:b/>
+                <w:sz w:val="24"/>
+                <w:szCs w:val="24"/>
+              </w:rPr>
+            </w:pPr>
+          </w:p>
+        </w:tc>
+        <w:tc>
+          <w:tcPr>
+            <w:tcW w:w="6949" w:type="dxa"/>
+            <w:tcBorders>
+              <w:top w:val="single" w:sz="4" w:space="0" w:color="auto"/>
+              <w:left w:val="single" w:sz="4" w:space="0" w:color="auto"/>
+              <w:bottom w:val="single" w:sz="4" w:space="0" w:color="auto"/>
+              <w:right w:val="single" w:sz="4" w:space="0" w:color="auto"/>
+            </w:tcBorders>
+            <w:vAlign w:val="center"/>
+          </w:tcPr>
+          <w:p>
+            <w:pPr>
+              <w:rPr>
+                <w:rFonts w:ascii="Times New Roman" w:hAnsi="Times New Roman" w:cs="Times New Roman"/>
+                <w:sz w:val="24"/>
+                <w:szCs w:val="24"/>
+              </w:rPr>
+            </w:pPr>
+            <w:r>
+              <w:rPr>
+                <w:rFonts w:ascii="Times New Roman" w:hAnsi="Times New Roman" w:cs="Times New Roman"/>
+                <w:sz w:val="24"/>
+                <w:szCs w:val="24"/>
+              </w:rPr>
+              <w:t>Jaunsarga vārds uzvārds: ${</w:t>
+            </w:r>
+            <w:proofErr w:type="spellStart"/>
+            <w:r>
+              <w:rPr>
+                <w:rFonts w:ascii="Times New Roman" w:hAnsi="Times New Roman" w:cs="Times New Roman"/>
+                <w:sz w:val="24"/>
+                <w:szCs w:val="24"/>
+              </w:rPr>
+              <w:t>jaunsarga_vards</w:t>
+            </w:r>
+            <w:proofErr w:type="spellEnd"/>
+            <w:r>
+              <w:rPr>
+                <w:rFonts w:ascii="Times New Roman" w:hAnsi="Times New Roman" w:cs="Times New Roman"/>
+                <w:sz w:val="24"/>
+                <w:szCs w:val="24"/>
+              </w:rPr>
+              <w:t xml:space="preserve">} </w:t>
             </w:r>
           </w:p>
         </w:tc>
@@ -945,62 +760,7 @@
                                 <w:rFonts w:ascii="Times New Roman" w:hAnsi="Times New Roman" w:cs="Times New Roman"/>
                                 <w:sz w:val="24"/>
                               </w:rPr>
-                              <w:t>pienem_vards</w:t>
-                            </w:r>
-                            <w:r>
-                              <w:rPr>
-                                <w:rFonts w:ascii="Times New Roman" w:hAnsi="Times New Roman" w:cs="Times New Roman"/>
-                                <w:sz w:val="24"/>
-                              </w:rPr>
-                              <w:t>_uzv</w:t>
-                            </w:r>
-                            <w:proofErr w:type="spellEnd"/>
-                            <w:r>
-                              <w:rPr>
-                                <w:rFonts w:ascii="Times New Roman" w:hAnsi="Times New Roman" w:cs="Times New Roman"/>
-                                <w:sz w:val="24"/>
-                              </w:rPr>
-                              <w:t>}, ${</w:t>
-                            </w:r>
-                            <w:proofErr w:type="spellStart"/>
-                            <w:r>
-                              <w:rPr>
-                                <w:rFonts w:ascii="Times New Roman" w:hAnsi="Times New Roman" w:cs="Times New Roman"/>
-                                <w:sz w:val="24"/>
-                              </w:rPr>
-                              <w:t>pienem_pers_kods</w:t>
-                            </w:r>
-                            <w:proofErr w:type="spellEnd"/>
-                            <w:r>
-                              <w:rPr>
-                                <w:rFonts w:ascii="Times New Roman" w:hAnsi="Times New Roman" w:cs="Times New Roman"/>
-                                <w:sz w:val="24"/>
-                              </w:rPr>
-                              <w:t>}, ${</w:t>
-                            </w:r>
-                            <w:proofErr w:type="spellStart"/>
-                            <w:r>
-                              <w:rPr>
-                                <w:rFonts w:ascii="Times New Roman" w:hAnsi="Times New Roman" w:cs="Times New Roman"/>
-                                <w:sz w:val="24"/>
-                              </w:rPr>
-                              <w:t>pienem_telefons</w:t>
-                            </w:r>
-                            <w:proofErr w:type="spellEnd"/>
-                            <w:r>
-                              <w:rPr>
-                                <w:rFonts w:ascii="Times New Roman" w:hAnsi="Times New Roman" w:cs="Times New Roman"/>
-                                <w:sz w:val="24"/>
-                              </w:rPr>
-                              <w:t>}, ${</w:t>
-                            </w:r>
-                            <w:proofErr w:type="spellStart"/>
-                            <w:r>
-                              <w:rPr>
-                                <w:rFonts w:ascii="Times New Roman" w:hAnsi="Times New Roman" w:cs="Times New Roman"/>
-                                <w:sz w:val="24"/>
-                              </w:rPr>
-                              <w:t>pienem_epasts</w:t>
+                              <w:t>pienem_personas_informacija</w:t>
                             </w:r>
                             <w:proofErr w:type="spellEnd"/>
                             <w:r>
@@ -1010,14 +770,6 @@
                               </w:rPr>
                               <w:t>}</w:t>
                             </w:r>
-                          </w:p>
-                          <w:p>
-                            <w:pPr>
-                              <w:rPr>
-                                <w:rFonts w:ascii="Times New Roman" w:hAnsi="Times New Roman" w:cs="Times New Roman"/>
-                                <w:sz w:val="24"/>
-                              </w:rPr>
-                            </w:pPr>
                           </w:p>
                         </w:txbxContent>
                       </wps:txbx>
@@ -1056,87 +808,8 @@
                           <w:rFonts w:ascii="Times New Roman" w:hAnsi="Times New Roman" w:cs="Times New Roman"/>
                           <w:sz w:val="24"/>
                         </w:rPr>
-                        <w:t>${</w:t>
+                        <w:t>${pienem_personas_informacija}</w:t>
                       </w:r>
-                      <w:proofErr w:type="spellStart"/>
-                      <w:r>
-                        <w:rPr>
-                          <w:rFonts w:ascii="Times New Roman" w:hAnsi="Times New Roman" w:cs="Times New Roman"/>
-                          <w:sz w:val="24"/>
-                        </w:rPr>
-                        <w:t>pienem_vards</w:t>
-                      </w:r>
-                      <w:r>
-                        <w:rPr>
-                          <w:rFonts w:ascii="Times New Roman" w:hAnsi="Times New Roman" w:cs="Times New Roman"/>
-                          <w:sz w:val="24"/>
-                        </w:rPr>
-                        <w:t>_uzv</w:t>
-                      </w:r>
-                      <w:proofErr w:type="spellEnd"/>
-                      <w:r>
-                        <w:rPr>
-                          <w:rFonts w:ascii="Times New Roman" w:hAnsi="Times New Roman" w:cs="Times New Roman"/>
-                          <w:sz w:val="24"/>
-                        </w:rPr>
-                        <w:t>}, ${</w:t>
-                      </w:r>
-                      <w:proofErr w:type="spellStart"/>
-                      <w:r>
-                        <w:rPr>
-                          <w:rFonts w:ascii="Times New Roman" w:hAnsi="Times New Roman" w:cs="Times New Roman"/>
-                          <w:sz w:val="24"/>
-                        </w:rPr>
-                        <w:t>pienem_pers_kods</w:t>
-                      </w:r>
-                      <w:proofErr w:type="spellEnd"/>
-                      <w:r>
-                        <w:rPr>
-                          <w:rFonts w:ascii="Times New Roman" w:hAnsi="Times New Roman" w:cs="Times New Roman"/>
-                          <w:sz w:val="24"/>
-                        </w:rPr>
-                        <w:t>}, ${</w:t>
-                      </w:r>
-                      <w:proofErr w:type="spellStart"/>
-                      <w:r>
-                        <w:rPr>
-                          <w:rFonts w:ascii="Times New Roman" w:hAnsi="Times New Roman" w:cs="Times New Roman"/>
-                          <w:sz w:val="24"/>
-                        </w:rPr>
-                        <w:t>pienem_telefons</w:t>
-                      </w:r>
-                      <w:proofErr w:type="spellEnd"/>
-                      <w:r>
-                        <w:rPr>
-                          <w:rFonts w:ascii="Times New Roman" w:hAnsi="Times New Roman" w:cs="Times New Roman"/>
-                          <w:sz w:val="24"/>
-                        </w:rPr>
-                        <w:t>}, ${</w:t>
-                      </w:r>
-                      <w:proofErr w:type="spellStart"/>
-                      <w:r>
-                        <w:rPr>
-                          <w:rFonts w:ascii="Times New Roman" w:hAnsi="Times New Roman" w:cs="Times New Roman"/>
-                          <w:sz w:val="24"/>
-                        </w:rPr>
-                        <w:t>pienem_epasts</w:t>
-                      </w:r>
-                      <w:proofErr w:type="spellEnd"/>
-                      <w:r>
-                        <w:rPr>
-                          <w:rFonts w:ascii="Times New Roman" w:hAnsi="Times New Roman" w:cs="Times New Roman"/>
-                          <w:sz w:val="24"/>
-                        </w:rPr>
-                        <w:t>}</w:t>
-                      </w:r>
-                    </w:p>
-                    <w:p>
-                      <w:pPr>
-                        <w:rPr>
-                          <w:rFonts w:ascii="Times New Roman" w:hAnsi="Times New Roman" w:cs="Times New Roman"/>
-                          <w:sz w:val="24"/>
-                        </w:rPr>
-                      </w:pPr>
                     </w:p>
                   </w:txbxContent>
                 </v:textbox>
@@ -1279,12 +952,12 @@
       </w:tblPr>
       <w:tblGrid>
         <w:gridCol w:w="1806"/>
-        <w:gridCol w:w="7087"/>
+        <w:gridCol w:w="6978"/>
       </w:tblGrid>
       <w:tr>
         <w:tc>
           <w:tcPr>
-            <w:tcW w:w="846" w:type="dxa"/>
+            <w:tcW w:w="1806" w:type="dxa"/>
             <w:tcBorders>
               <w:top w:val="single" w:sz="4" w:space="0" w:color="auto"/>
               <w:left w:val="single" w:sz="4" w:space="0" w:color="auto"/>
@@ -1294,6 +967,7 @@
           </w:tcPr>
           <w:p>
             <w:pPr>
+              <w:jc w:val="center"/>
               <w:rPr>
                 <w:rFonts w:ascii="Times New Roman" w:hAnsi="Times New Roman" w:cs="Times New Roman"/>
                 <w:b/>
@@ -1343,7 +1017,7 @@
         </w:tc>
         <w:tc>
           <w:tcPr>
-            <w:tcW w:w="7087" w:type="dxa"/>
+            <w:tcW w:w="6978" w:type="dxa"/>
             <w:tcBorders>
               <w:top w:val="single" w:sz="4" w:space="0" w:color="auto"/>
               <w:left w:val="single" w:sz="4" w:space="0" w:color="auto"/>
@@ -1384,7 +1058,7 @@
       <w:tr>
         <w:tc>
           <w:tcPr>
-            <w:tcW w:w="846" w:type="dxa"/>
+            <w:tcW w:w="1806" w:type="dxa"/>
             <w:tcBorders>
               <w:top w:val="single" w:sz="4" w:space="0" w:color="auto"/>
               <w:left w:val="single" w:sz="4" w:space="0" w:color="auto"/>
@@ -1394,6 +1068,7 @@
           </w:tcPr>
           <w:p>
             <w:pPr>
+              <w:jc w:val="center"/>
               <w:rPr>
                 <w:rFonts w:ascii="Times New Roman" w:hAnsi="Times New Roman" w:cs="Times New Roman"/>
                 <w:b/>
@@ -1443,7 +1118,7 @@
         </w:tc>
         <w:tc>
           <w:tcPr>
-            <w:tcW w:w="7087" w:type="dxa"/>
+            <w:tcW w:w="6978" w:type="dxa"/>
             <w:tcBorders>
               <w:top w:val="single" w:sz="4" w:space="0" w:color="auto"/>
               <w:left w:val="single" w:sz="4" w:space="0" w:color="auto"/>
@@ -1474,7 +1149,7 @@
       <w:tr>
         <w:tc>
           <w:tcPr>
-            <w:tcW w:w="846" w:type="dxa"/>
+            <w:tcW w:w="1806" w:type="dxa"/>
             <w:tcBorders>
               <w:top w:val="single" w:sz="4" w:space="0" w:color="auto"/>
               <w:left w:val="single" w:sz="4" w:space="0" w:color="auto"/>
@@ -1484,6 +1159,7 @@
           </w:tcPr>
           <w:p>
             <w:pPr>
+              <w:jc w:val="center"/>
               <w:rPr>
                 <w:rFonts w:ascii="Times New Roman" w:hAnsi="Times New Roman" w:cs="Times New Roman"/>
                 <w:b/>
@@ -1533,7 +1209,7 @@
         </w:tc>
         <w:tc>
           <w:tcPr>
-            <w:tcW w:w="7087" w:type="dxa"/>
+            <w:tcW w:w="6978" w:type="dxa"/>
             <w:tcBorders>
               <w:top w:val="single" w:sz="4" w:space="0" w:color="auto"/>
               <w:left w:val="single" w:sz="4" w:space="0" w:color="auto"/>
@@ -1575,7 +1251,7 @@
         </w:trPr>
         <w:tc>
           <w:tcPr>
-            <w:tcW w:w="846" w:type="dxa"/>
+            <w:tcW w:w="1806" w:type="dxa"/>
             <w:tcBorders>
               <w:top w:val="single" w:sz="4" w:space="0" w:color="auto"/>
               <w:left w:val="single" w:sz="4" w:space="0" w:color="auto"/>
@@ -1597,7 +1273,7 @@
         </w:tc>
         <w:tc>
           <w:tcPr>
-            <w:tcW w:w="7087" w:type="dxa"/>
+            <w:tcW w:w="6978" w:type="dxa"/>
             <w:tcBorders>
               <w:top w:val="single" w:sz="4" w:space="0" w:color="auto"/>
               <w:left w:val="single" w:sz="4" w:space="0" w:color="auto"/>
@@ -1630,7 +1306,41 @@
                 <w:sz w:val="24"/>
                 <w:szCs w:val="24"/>
               </w:rPr>
-              <w:t xml:space="preserve">  </w:t>
+              <w:t xml:space="preserve"> </w:t>
+            </w:r>
+            <w:r>
+              <w:rPr>
+                <w:rFonts w:ascii="Times New Roman" w:hAnsi="Times New Roman" w:cs="Times New Roman"/>
+                <w:sz w:val="24"/>
+                <w:szCs w:val="24"/>
+              </w:rPr>
+              <w:t>${</w:t>
+            </w:r>
+            <w:proofErr w:type="spellStart"/>
+            <w:r>
+              <w:rPr>
+                <w:rFonts w:ascii="Times New Roman" w:hAnsi="Times New Roman" w:cs="Times New Roman"/>
+                <w:sz w:val="24"/>
+                <w:szCs w:val="24"/>
+              </w:rPr>
+              <w:t>jaunsarga_vards</w:t>
+            </w:r>
+            <w:proofErr w:type="spellEnd"/>
+            <w:r>
+              <w:rPr>
+                <w:rFonts w:ascii="Times New Roman" w:hAnsi="Times New Roman" w:cs="Times New Roman"/>
+                <w:sz w:val="24"/>
+                <w:szCs w:val="24"/>
+              </w:rPr>
+              <w:t>}</w:t>
+            </w:r>
+            <w:r>
+              <w:rPr>
+                <w:rFonts w:ascii="Times New Roman" w:hAnsi="Times New Roman" w:cs="Times New Roman"/>
+                <w:sz w:val="24"/>
+                <w:szCs w:val="24"/>
+              </w:rPr>
+              <w:t xml:space="preserve"> </w:t>
             </w:r>
           </w:p>
         </w:tc>
@@ -1672,11 +1382,11 @@
         <w:tblLook w:val="04A0" w:firstRow="1" w:lastRow="0" w:firstColumn="1" w:lastColumn="0" w:noHBand="0" w:noVBand="1"/>
       </w:tblPr>
       <w:tblGrid>
-        <w:gridCol w:w="1287"/>
-        <w:gridCol w:w="2518"/>
+        <w:gridCol w:w="1279"/>
+        <w:gridCol w:w="2522"/>
         <w:gridCol w:w="1657"/>
         <w:gridCol w:w="1554"/>
-        <w:gridCol w:w="2328"/>
+        <w:gridCol w:w="2332"/>
       </w:tblGrid>
       <w:tr>
         <w:tc>
@@ -1858,7 +1568,7 @@
           </w:tcPr>
           <w:p>
             <w:pPr>
-              <w:ind w:left="360"/>
+              <w:jc w:val="center"/>
               <w:rPr>
                 <w:rFonts w:ascii="Times New Roman" w:hAnsi="Times New Roman" w:cs="Times New Roman"/>
                 <w:sz w:val="24"/>
@@ -1899,6 +1609,7 @@
           </w:tcPr>
           <w:p>
             <w:pPr>
+              <w:jc w:val="center"/>
               <w:rPr>
                 <w:rFonts w:ascii="Times New Roman" w:hAnsi="Times New Roman" w:cs="Times New Roman"/>
                 <w:sz w:val="24"/>
@@ -2135,23 +1846,23 @@
                 <w:sz w:val="24"/>
                 <w:szCs w:val="24"/>
               </w:rPr>
-              <w:t>_</w:t>
-            </w:r>
-            <w:r>
-              <w:rPr>
-                <w:rFonts w:ascii="Times New Roman" w:hAnsi="Times New Roman" w:cs="Times New Roman"/>
-                <w:sz w:val="24"/>
-                <w:szCs w:val="24"/>
-              </w:rPr>
-              <w:t>____</w:t>
-            </w:r>
-            <w:r>
-              <w:rPr>
-                <w:rFonts w:ascii="Times New Roman" w:hAnsi="Times New Roman" w:cs="Times New Roman"/>
-                <w:sz w:val="24"/>
-                <w:szCs w:val="24"/>
-              </w:rPr>
-              <w:t xml:space="preserve">.____.202___.                                         </w:t>
+              <w:t>$</w:t>
+            </w:r>
+            <w:r>
+              <w:rPr>
+                <w:rFonts w:ascii="Times New Roman" w:hAnsi="Times New Roman" w:cs="Times New Roman"/>
+                <w:sz w:val="24"/>
+                <w:szCs w:val="24"/>
+              </w:rPr>
+              <w:t>{datums}</w:t>
+            </w:r>
+            <w:r>
+              <w:rPr>
+                <w:rFonts w:ascii="Times New Roman" w:hAnsi="Times New Roman" w:cs="Times New Roman"/>
+                <w:sz w:val="24"/>
+                <w:szCs w:val="24"/>
+              </w:rPr>
+              <w:t xml:space="preserve">                                         </w:t>
             </w:r>
           </w:p>
           <w:p>
@@ -2368,17 +2079,16 @@
                 <w:sz w:val="24"/>
                 <w:szCs w:val="24"/>
               </w:rPr>
-              <w:t xml:space="preserve">_____.____.202___.   </w:t>
-            </w:r>
-          </w:p>
-          <w:p>
-            <w:pPr>
-              <w:rPr>
-                <w:rFonts w:ascii="Times New Roman" w:hAnsi="Times New Roman" w:cs="Times New Roman"/>
-                <w:sz w:val="24"/>
-                <w:szCs w:val="24"/>
-              </w:rPr>
-            </w:pPr>
+              <w:t>$</w:t>
+            </w:r>
+            <w:r>
+              <w:rPr>
+                <w:rFonts w:ascii="Times New Roman" w:hAnsi="Times New Roman" w:cs="Times New Roman"/>
+                <w:sz w:val="24"/>
+                <w:szCs w:val="24"/>
+              </w:rPr>
+              <w:t>{datums}</w:t>
+            </w:r>
             <w:r>
               <w:rPr>
                 <w:rFonts w:ascii="Times New Roman" w:hAnsi="Times New Roman" w:cs="Times New Roman"/>

</xml_diff>